<commit_message>
checkin 1 report and eval code updates
</commit_message>
<xml_diff>
--- a/docs/checkin1_report.docx
+++ b/docs/checkin1_report.docx
@@ -51,7 +51,7 @@
     </w:p>
     <w:p>
       <w:pPr>
-        <w:ind w:left="720" w:first-line="-720"/>
+        <w:ind w:left="720"/>
         <w:spacing w:after="80"/>
       </w:pPr>
       <w:r>
@@ -71,7 +71,7 @@
     </w:p>
     <w:p>
       <w:pPr>
-        <w:ind w:left="720" w:first-line="-720"/>
+        <w:ind w:left="720"/>
         <w:spacing w:after="80"/>
       </w:pPr>
       <w:r>
@@ -91,7 +91,7 @@
     </w:p>
     <w:p>
       <w:pPr>
-        <w:ind w:left="720" w:first-line="-720"/>
+        <w:ind w:left="720"/>
         <w:spacing w:after="80"/>
       </w:pPr>
       <w:r>
@@ -111,7 +111,7 @@
     </w:p>
     <w:p>
       <w:pPr>
-        <w:ind w:left="720" w:first-line="-720"/>
+        <w:ind w:left="720"/>
         <w:spacing w:after="80"/>
       </w:pPr>
       <w:r>
@@ -131,7 +131,7 @@
     </w:p>
     <w:p>
       <w:pPr>
-        <w:ind w:left="720" w:first-line="-720"/>
+        <w:ind w:left="720"/>
         <w:spacing w:after="80"/>
       </w:pPr>
       <w:r>
@@ -266,7 +266,7 @@
           <w:b/>
           <w:color w:val="000000"/>
         </w:rPr>
-        <w:t xml:space="preserve">I used Claude Code to help write boilerplate code, debug API issues, and draft and format this report. I ran the evaluation reported here myself and checked the results.</w:t>
+        <w:t xml:space="preserve">I used Claude Code to help write boilerplate code and debug API issues (which I ran into many of). I ran the evaluation reported here myself and checked/interpreted the results.</w:t>
       </w:r>
     </w:p>
     <w:p>
@@ -286,7 +286,7 @@
     </w:p>
     <w:p>
       <w:pPr>
-        <w:ind w:left="720" w:first-line="-720"/>
+        <w:ind w:left="720"/>
         <w:spacing w:after="60"/>
       </w:pPr>
       <w:r>
@@ -306,7 +306,7 @@
     </w:p>
     <w:p>
       <w:pPr>
-        <w:ind w:left="720" w:first-line="-720"/>
+        <w:ind w:left="720"/>
         <w:spacing w:after="60"/>
       </w:pPr>
       <w:r>
@@ -326,7 +326,7 @@
     </w:p>
     <w:p>
       <w:pPr>
-        <w:ind w:left="720" w:first-line="-720"/>
+        <w:ind w:left="720"/>
         <w:spacing w:after="60"/>
       </w:pPr>
       <w:r>
@@ -346,7 +346,7 @@
     </w:p>
     <w:p>
       <w:pPr>
-        <w:ind w:left="720" w:first-line="-720"/>
+        <w:ind w:left="720"/>
         <w:spacing w:after="60"/>
       </w:pPr>
       <w:r>
@@ -366,7 +366,7 @@
     </w:p>
     <w:p>
       <w:pPr>
-        <w:ind w:left="720" w:first-line="-720"/>
+        <w:ind w:left="720"/>
         <w:spacing w:after="60"/>
       </w:pPr>
       <w:r>
@@ -386,7 +386,7 @@
     </w:p>
     <w:p>
       <w:pPr>
-        <w:ind w:left="720" w:first-line="-720"/>
+        <w:ind w:left="720"/>
         <w:spacing w:after="60"/>
       </w:pPr>
       <w:r>
@@ -406,7 +406,7 @@
     </w:p>
     <w:p>
       <w:pPr>
-        <w:ind w:left="720" w:first-line="-720"/>
+        <w:ind w:left="720"/>
         <w:spacing w:after="60"/>
       </w:pPr>
       <w:r>
@@ -426,7 +426,7 @@
     </w:p>
     <w:p>
       <w:pPr>
-        <w:ind w:left="720" w:first-line="-720"/>
+        <w:ind w:left="720"/>
         <w:spacing w:after="60"/>
       </w:pPr>
       <w:r>
@@ -446,7 +446,7 @@
     </w:p>
     <w:p>
       <w:pPr>
-        <w:ind w:left="720" w:first-line="-720"/>
+        <w:ind w:left="720"/>
         <w:spacing w:after="60"/>
       </w:pPr>
       <w:r>
@@ -466,7 +466,7 @@
     </w:p>
     <w:p>
       <w:pPr>
-        <w:ind w:left="720" w:first-line="-720"/>
+        <w:ind w:left="720"/>
         <w:spacing w:after="60"/>
       </w:pPr>
       <w:r>
@@ -486,7 +486,7 @@
     </w:p>
     <w:p>
       <w:pPr>
-        <w:ind w:left="720" w:first-line="-720"/>
+        <w:ind w:left="720"/>
         <w:spacing w:after="60"/>
       </w:pPr>
       <w:r>
@@ -506,7 +506,7 @@
     </w:p>
     <w:p>
       <w:pPr>
-        <w:ind w:left="720" w:first-line="-720"/>
+        <w:ind w:left="720"/>
         <w:spacing w:after="60"/>
       </w:pPr>
       <w:r>
@@ -526,7 +526,7 @@
     </w:p>
     <w:p>
       <w:pPr>
-        <w:ind w:left="720" w:first-line="-720"/>
+        <w:ind w:left="720"/>
         <w:spacing w:after="60"/>
       </w:pPr>
       <w:r>
@@ -546,7 +546,7 @@
     </w:p>
     <w:p>
       <w:pPr>
-        <w:ind w:left="720" w:first-line="-720"/>
+        <w:ind w:left="720"/>
         <w:spacing w:after="60"/>
       </w:pPr>
       <w:r>
@@ -566,7 +566,7 @@
     </w:p>
     <w:p>
       <w:pPr>
-        <w:ind w:left="720" w:first-line="-720"/>
+        <w:ind w:left="720"/>
         <w:spacing w:after="60"/>
       </w:pPr>
       <w:r>
@@ -586,7 +586,7 @@
     </w:p>
     <w:p>
       <w:pPr>
-        <w:ind w:left="720" w:first-line="-720"/>
+        <w:ind w:left="720"/>
         <w:spacing w:after="60"/>
       </w:pPr>
       <w:r>
@@ -606,7 +606,7 @@
     </w:p>
     <w:p>
       <w:pPr>
-        <w:ind w:left="720" w:first-line="-720"/>
+        <w:ind w:left="720"/>
         <w:spacing w:after="60"/>
       </w:pPr>
       <w:r>
@@ -626,7 +626,7 @@
     </w:p>
     <w:p>
       <w:pPr>
-        <w:ind w:left="720" w:first-line="-720"/>
+        <w:ind w:left="720"/>
         <w:spacing w:after="60"/>
       </w:pPr>
       <w:r>
@@ -646,7 +646,7 @@
     </w:p>
     <w:p>
       <w:pPr>
-        <w:ind w:left="720" w:first-line="-720"/>
+        <w:ind w:left="720"/>
         <w:spacing w:after="60"/>
       </w:pPr>
       <w:r>
@@ -666,7 +666,7 @@
     </w:p>
     <w:p>
       <w:pPr>
-        <w:ind w:left="720" w:first-line="-720"/>
+        <w:ind w:left="720"/>
         <w:spacing w:after="60"/>
       </w:pPr>
       <w:r>
@@ -686,7 +686,7 @@
     </w:p>
     <w:p>
       <w:pPr>
-        <w:ind w:left="720" w:first-line="-720"/>
+        <w:ind w:left="720"/>
         <w:spacing w:after="60"/>
       </w:pPr>
       <w:r>
@@ -706,7 +706,7 @@
     </w:p>
     <w:p>
       <w:pPr>
-        <w:ind w:left="720" w:first-line="-720"/>
+        <w:ind w:left="720"/>
         <w:spacing w:after="60"/>
       </w:pPr>
       <w:r>
@@ -726,7 +726,7 @@
     </w:p>
     <w:p>
       <w:pPr>
-        <w:ind w:left="720" w:first-line="-720"/>
+        <w:ind w:left="720"/>
         <w:spacing w:after="60"/>
       </w:pPr>
       <w:r>
@@ -746,7 +746,7 @@
     </w:p>
     <w:p>
       <w:pPr>
-        <w:ind w:left="720" w:first-line="-720"/>
+        <w:ind w:left="720"/>
         <w:spacing w:after="60"/>
       </w:pPr>
       <w:r>
@@ -766,7 +766,7 @@
     </w:p>
     <w:p>
       <w:pPr>
-        <w:ind w:left="720" w:first-line="-720"/>
+        <w:ind w:left="720"/>
         <w:spacing w:after="60"/>
       </w:pPr>
       <w:r>
@@ -786,7 +786,7 @@
     </w:p>
     <w:p>
       <w:pPr>
-        <w:ind w:left="720" w:first-line="-720"/>
+        <w:ind w:left="720"/>
         <w:spacing w:after="60"/>
       </w:pPr>
       <w:r>
@@ -806,7 +806,7 @@
     </w:p>
     <w:p>
       <w:pPr>
-        <w:ind w:left="720" w:first-line="-720"/>
+        <w:ind w:left="720"/>
         <w:spacing w:after="60"/>
       </w:pPr>
       <w:r>
@@ -826,7 +826,7 @@
     </w:p>
     <w:p>
       <w:pPr>
-        <w:ind w:left="720" w:first-line="-720"/>
+        <w:ind w:left="720"/>
         <w:spacing w:after="60"/>
       </w:pPr>
       <w:r>
@@ -846,7 +846,7 @@
     </w:p>
     <w:p>
       <w:pPr>
-        <w:ind w:left="720" w:first-line="-720"/>
+        <w:ind w:left="720"/>
         <w:spacing w:after="60"/>
       </w:pPr>
       <w:r>
@@ -866,7 +866,7 @@
     </w:p>
     <w:p>
       <w:pPr>
-        <w:ind w:left="720" w:first-line="-720"/>
+        <w:ind w:left="720"/>
         <w:spacing w:after="60"/>
       </w:pPr>
       <w:r>
@@ -886,7 +886,7 @@
     </w:p>
     <w:p>
       <w:pPr>
-        <w:ind w:left="720" w:first-line="-720"/>
+        <w:ind w:left="720"/>
         <w:spacing w:after="60"/>
       </w:pPr>
       <w:r>

</xml_diff>